<commit_message>
Fix list numbering bug in Final Project Report (each section now restarts independently)
</commit_message>
<xml_diff>
--- a/7NVENT_Final_Project_Report.docx
+++ b/7NVENT_Final_Project_Report.docx
@@ -3326,7 +3326,7 @@
         <w:pStyle w:val="ListParagraph"/>
         <w:numPr>
           <w:ilvl w:val="0"/>
-          <w:numId w:val="2"/>
+          <w:numId w:val="3"/>
         </w:numPr>
         <w:spacing w:after="100" w:line="360"/>
       </w:pPr>
@@ -3344,7 +3344,7 @@
         <w:pStyle w:val="ListParagraph"/>
         <w:numPr>
           <w:ilvl w:val="0"/>
-          <w:numId w:val="2"/>
+          <w:numId w:val="3"/>
         </w:numPr>
         <w:spacing w:after="100" w:line="360"/>
       </w:pPr>
@@ -3362,7 +3362,7 @@
         <w:pStyle w:val="ListParagraph"/>
         <w:numPr>
           <w:ilvl w:val="0"/>
-          <w:numId w:val="2"/>
+          <w:numId w:val="3"/>
         </w:numPr>
         <w:spacing w:after="100" w:line="360"/>
       </w:pPr>
@@ -3380,7 +3380,7 @@
         <w:pStyle w:val="ListParagraph"/>
         <w:numPr>
           <w:ilvl w:val="0"/>
-          <w:numId w:val="2"/>
+          <w:numId w:val="3"/>
         </w:numPr>
         <w:spacing w:after="100" w:line="360"/>
       </w:pPr>
@@ -3398,7 +3398,7 @@
         <w:pStyle w:val="ListParagraph"/>
         <w:numPr>
           <w:ilvl w:val="0"/>
-          <w:numId w:val="2"/>
+          <w:numId w:val="3"/>
         </w:numPr>
         <w:spacing w:after="100" w:line="360"/>
       </w:pPr>
@@ -3416,7 +3416,7 @@
         <w:pStyle w:val="ListParagraph"/>
         <w:numPr>
           <w:ilvl w:val="0"/>
-          <w:numId w:val="2"/>
+          <w:numId w:val="3"/>
         </w:numPr>
         <w:spacing w:after="100" w:line="360"/>
       </w:pPr>
@@ -3434,7 +3434,7 @@
         <w:pStyle w:val="ListParagraph"/>
         <w:numPr>
           <w:ilvl w:val="0"/>
-          <w:numId w:val="2"/>
+          <w:numId w:val="3"/>
         </w:numPr>
         <w:spacing w:after="100" w:line="360"/>
       </w:pPr>
@@ -4528,7 +4528,7 @@
         <w:pStyle w:val="ListParagraph"/>
         <w:numPr>
           <w:ilvl w:val="0"/>
-          <w:numId w:val="2"/>
+          <w:numId w:val="4"/>
         </w:numPr>
         <w:spacing w:after="100" w:line="360"/>
       </w:pPr>
@@ -4546,7 +4546,7 @@
         <w:pStyle w:val="ListParagraph"/>
         <w:numPr>
           <w:ilvl w:val="0"/>
-          <w:numId w:val="2"/>
+          <w:numId w:val="4"/>
         </w:numPr>
         <w:spacing w:after="100" w:line="360"/>
       </w:pPr>
@@ -4564,7 +4564,7 @@
         <w:pStyle w:val="ListParagraph"/>
         <w:numPr>
           <w:ilvl w:val="0"/>
-          <w:numId w:val="2"/>
+          <w:numId w:val="4"/>
         </w:numPr>
         <w:spacing w:after="100" w:line="360"/>
       </w:pPr>
@@ -4582,7 +4582,7 @@
         <w:pStyle w:val="ListParagraph"/>
         <w:numPr>
           <w:ilvl w:val="0"/>
-          <w:numId w:val="2"/>
+          <w:numId w:val="4"/>
         </w:numPr>
         <w:spacing w:after="100" w:line="360"/>
       </w:pPr>
@@ -8543,7 +8543,7 @@
         <w:pStyle w:val="ListParagraph"/>
         <w:numPr>
           <w:ilvl w:val="0"/>
-          <w:numId w:val="2"/>
+          <w:numId w:val="5"/>
         </w:numPr>
         <w:spacing w:after="100" w:line="360"/>
       </w:pPr>
@@ -8561,7 +8561,7 @@
         <w:pStyle w:val="ListParagraph"/>
         <w:numPr>
           <w:ilvl w:val="0"/>
-          <w:numId w:val="2"/>
+          <w:numId w:val="5"/>
         </w:numPr>
         <w:spacing w:after="100" w:line="360"/>
       </w:pPr>
@@ -8579,7 +8579,7 @@
         <w:pStyle w:val="ListParagraph"/>
         <w:numPr>
           <w:ilvl w:val="0"/>
-          <w:numId w:val="2"/>
+          <w:numId w:val="5"/>
         </w:numPr>
         <w:spacing w:after="100" w:line="360"/>
       </w:pPr>
@@ -8597,7 +8597,7 @@
         <w:pStyle w:val="ListParagraph"/>
         <w:numPr>
           <w:ilvl w:val="0"/>
-          <w:numId w:val="2"/>
+          <w:numId w:val="5"/>
         </w:numPr>
         <w:spacing w:after="100" w:line="360"/>
       </w:pPr>
@@ -8615,7 +8615,7 @@
         <w:pStyle w:val="ListParagraph"/>
         <w:numPr>
           <w:ilvl w:val="0"/>
-          <w:numId w:val="2"/>
+          <w:numId w:val="5"/>
         </w:numPr>
         <w:spacing w:after="100" w:line="360"/>
       </w:pPr>
@@ -11939,7 +11939,7 @@
         <w:pStyle w:val="ListParagraph"/>
         <w:numPr>
           <w:ilvl w:val="0"/>
-          <w:numId w:val="2"/>
+          <w:numId w:val="6"/>
         </w:numPr>
         <w:spacing w:after="100" w:line="360"/>
       </w:pPr>
@@ -11957,7 +11957,7 @@
         <w:pStyle w:val="ListParagraph"/>
         <w:numPr>
           <w:ilvl w:val="0"/>
-          <w:numId w:val="2"/>
+          <w:numId w:val="6"/>
         </w:numPr>
         <w:spacing w:after="100" w:line="360"/>
       </w:pPr>
@@ -11975,7 +11975,7 @@
         <w:pStyle w:val="ListParagraph"/>
         <w:numPr>
           <w:ilvl w:val="0"/>
-          <w:numId w:val="2"/>
+          <w:numId w:val="6"/>
         </w:numPr>
         <w:spacing w:after="100" w:line="360"/>
       </w:pPr>
@@ -11993,7 +11993,7 @@
         <w:pStyle w:val="ListParagraph"/>
         <w:numPr>
           <w:ilvl w:val="0"/>
-          <w:numId w:val="2"/>
+          <w:numId w:val="6"/>
         </w:numPr>
         <w:spacing w:after="100" w:line="360"/>
       </w:pPr>
@@ -12047,7 +12047,7 @@
         <w:pStyle w:val="ListParagraph"/>
         <w:numPr>
           <w:ilvl w:val="0"/>
-          <w:numId w:val="2"/>
+          <w:numId w:val="7"/>
         </w:numPr>
         <w:spacing w:after="100" w:line="360"/>
       </w:pPr>
@@ -12065,7 +12065,7 @@
         <w:pStyle w:val="ListParagraph"/>
         <w:numPr>
           <w:ilvl w:val="0"/>
-          <w:numId w:val="2"/>
+          <w:numId w:val="7"/>
         </w:numPr>
         <w:spacing w:after="100" w:line="360"/>
       </w:pPr>
@@ -14045,6 +14045,78 @@
       </w:pPr>
     </w:lvl>
   </w:abstractNum>
+  <w:abstractNum w:abstractNumId="3" w15:restartNumberingAfterBreak="0">
+    <w:multiLevelType w:val="hybridMultilevel"/>
+    <w:lvl w:ilvl="0" w15:tentative="1">
+      <w:start w:val="1"/>
+      <w:numFmt w:val="bullet"/>
+      <w:lvlText w:val="•"/>
+      <w:lvlJc w:val="left"/>
+      <w:pPr>
+        <w:ind w:left="720" w:hanging="360"/>
+      </w:pPr>
+    </w:lvl>
+  </w:abstractNum>
+  <w:abstractNum w:abstractNumId="4" w15:restartNumberingAfterBreak="0">
+    <w:multiLevelType w:val="hybridMultilevel"/>
+    <w:lvl w:ilvl="0" w15:tentative="1">
+      <w:start w:val="1"/>
+      <w:numFmt w:val="bullet"/>
+      <w:lvlText w:val="•"/>
+      <w:lvlJc w:val="left"/>
+      <w:pPr>
+        <w:ind w:left="720" w:hanging="360"/>
+      </w:pPr>
+    </w:lvl>
+  </w:abstractNum>
+  <w:abstractNum w:abstractNumId="5" w15:restartNumberingAfterBreak="0">
+    <w:multiLevelType w:val="hybridMultilevel"/>
+    <w:lvl w:ilvl="0" w15:tentative="1">
+      <w:start w:val="1"/>
+      <w:numFmt w:val="bullet"/>
+      <w:lvlText w:val="•"/>
+      <w:lvlJc w:val="left"/>
+      <w:pPr>
+        <w:ind w:left="720" w:hanging="360"/>
+      </w:pPr>
+    </w:lvl>
+  </w:abstractNum>
+  <w:abstractNum w:abstractNumId="6" w15:restartNumberingAfterBreak="0">
+    <w:multiLevelType w:val="hybridMultilevel"/>
+    <w:lvl w:ilvl="0" w15:tentative="1">
+      <w:start w:val="1"/>
+      <w:numFmt w:val="bullet"/>
+      <w:lvlText w:val="•"/>
+      <w:lvlJc w:val="left"/>
+      <w:pPr>
+        <w:ind w:left="720" w:hanging="360"/>
+      </w:pPr>
+    </w:lvl>
+  </w:abstractNum>
+  <w:abstractNum w:abstractNumId="7" w15:restartNumberingAfterBreak="0">
+    <w:multiLevelType w:val="hybridMultilevel"/>
+    <w:lvl w:ilvl="0" w15:tentative="1">
+      <w:start w:val="1"/>
+      <w:numFmt w:val="bullet"/>
+      <w:lvlText w:val="•"/>
+      <w:lvlJc w:val="left"/>
+      <w:pPr>
+        <w:ind w:left="720" w:hanging="360"/>
+      </w:pPr>
+    </w:lvl>
+  </w:abstractNum>
+  <w:abstractNum w:abstractNumId="8" w15:restartNumberingAfterBreak="0">
+    <w:multiLevelType w:val="hybridMultilevel"/>
+    <w:lvl w:ilvl="0" w15:tentative="1">
+      <w:start w:val="1"/>
+      <w:numFmt w:val="bullet"/>
+      <w:lvlText w:val="•"/>
+      <w:lvlJc w:val="left"/>
+      <w:pPr>
+        <w:ind w:left="720" w:hanging="360"/>
+      </w:pPr>
+    </w:lvl>
+  </w:abstractNum>
   <w:num w:numId="1">
     <w:abstractNumId w:val="1"/>
     <w:lvlOverride w:ilvl="0">
@@ -14052,7 +14124,37 @@
     </w:lvlOverride>
   </w:num>
   <w:num w:numId="2">
-    <w:abstractNumId w:val="2"/>
+    <w:abstractNumId w:val="3"/>
+    <w:lvlOverride w:ilvl="0">
+      <w:startOverride w:val="1"/>
+    </w:lvlOverride>
+  </w:num>
+  <w:num w:numId="3">
+    <w:abstractNumId w:val="4"/>
+    <w:lvlOverride w:ilvl="0">
+      <w:startOverride w:val="1"/>
+    </w:lvlOverride>
+  </w:num>
+  <w:num w:numId="4">
+    <w:abstractNumId w:val="5"/>
+    <w:lvlOverride w:ilvl="0">
+      <w:startOverride w:val="1"/>
+    </w:lvlOverride>
+  </w:num>
+  <w:num w:numId="5">
+    <w:abstractNumId w:val="6"/>
+    <w:lvlOverride w:ilvl="0">
+      <w:startOverride w:val="1"/>
+    </w:lvlOverride>
+  </w:num>
+  <w:num w:numId="6">
+    <w:abstractNumId w:val="7"/>
+    <w:lvlOverride w:ilvl="0">
+      <w:startOverride w:val="1"/>
+    </w:lvlOverride>
+  </w:num>
+  <w:num w:numId="7">
+    <w:abstractNumId w:val="8"/>
     <w:lvlOverride w:ilvl="0">
       <w:startOverride w:val="1"/>
     </w:lvlOverride>

</xml_diff>